<commit_message>
Drop I. numbering on APPENDIX and refresh the 14-page OJS pack after the editor's single-file table rule.
Co-authored-by: Cursor <cursoragent@cursor.com>
</commit_message>
<xml_diff>
--- a/sparse-calibration-kt/IJIET_FINAL_REVISION/manuscript/Reproducible Sparse-Concept and Calibration Diagnostics for Knowledge Tracing.docx
+++ b/sparse-calibration-kt/IJIET_FINAL_REVISION/manuscript/Reproducible Sparse-Concept and Calibration Diagnostics for Knowledge Tracing.docx
@@ -11143,6 +11143,10 @@
     <w:p>
       <w:pPr>
         <w:pStyle w:val="Heading1"/>
+        <w:numPr>
+          <w:ilvl w:val="0"/>
+          <w:numId w:val="0"/>
+        </w:numPr>
         <w:spacing w:before="0"/>
       </w:pPr>
       <w:r>

</xml_diff>